<commit_message>
Created a debug pipeline
</commit_message>
<xml_diff>
--- a/Documentation/Requirement_Analysis.docx
+++ b/Documentation/Requirement_Analysis.docx
@@ -935,21 +935,19 @@
           <w:lang w:val="en-US"/>
         </w:rPr>
       </w:pPr>
-      <w:proofErr w:type="spellStart"/>
-      <w:r>
-        <w:rPr>
-          <w:rFonts w:ascii="Times New Roman" w:hAnsi="Times New Roman" w:cs="Times New Roman"/>
-          <w:lang w:val="en-US"/>
-        </w:rPr>
-        <w:t>essages</w:t>
-      </w:r>
-      <w:proofErr w:type="spellEnd"/>
-      <w:r>
-        <w:rPr>
-          <w:rFonts w:ascii="Times New Roman" w:hAnsi="Times New Roman" w:cs="Times New Roman"/>
-          <w:lang w:val="en-US"/>
-        </w:rPr>
-        <w:t xml:space="preserve"> later: The model responds in plain text.</w:t>
+      <w:r>
+        <w:rPr>
+          <w:rFonts w:ascii="Times New Roman" w:hAnsi="Times New Roman" w:cs="Times New Roman"/>
+          <w:lang w:val="en-US"/>
+        </w:rPr>
+        <w:t>m</w:t>
+      </w:r>
+      <w:r>
+        <w:rPr>
+          <w:rFonts w:ascii="Times New Roman" w:hAnsi="Times New Roman" w:cs="Times New Roman"/>
+          <w:lang w:val="en-US"/>
+        </w:rPr>
+        <w:t>essages later: The model responds in plain text.</w:t>
       </w:r>
     </w:p>
     <w:p>
@@ -4011,21 +4009,12 @@
         </w:rPr>
         <w:t xml:space="preserve">: </w:t>
       </w:r>
-      <w:proofErr w:type="gramStart"/>
-      <w:r>
-        <w:rPr>
-          <w:rFonts w:ascii="Times New Roman" w:hAnsi="Times New Roman" w:cs="Times New Roman"/>
-          <w:lang w:val="en-US"/>
-        </w:rPr>
-        <w:t>Measures</w:t>
-      </w:r>
-      <w:proofErr w:type="gramEnd"/>
-      <w:r>
-        <w:rPr>
-          <w:rFonts w:ascii="Times New Roman" w:hAnsi="Times New Roman" w:cs="Times New Roman"/>
-          <w:lang w:val="en-US"/>
-        </w:rPr>
-        <w:t xml:space="preserve"> </w:t>
+      <w:r>
+        <w:rPr>
+          <w:rFonts w:ascii="Times New Roman" w:hAnsi="Times New Roman" w:cs="Times New Roman"/>
+          <w:lang w:val="en-US"/>
+        </w:rPr>
+        <w:t xml:space="preserve">Measures </w:t>
       </w:r>
       <w:r>
         <w:rPr>
@@ -5826,21 +5815,12 @@
         </w:rPr>
         <w:t xml:space="preserve"> </w:t>
       </w:r>
-      <w:proofErr w:type="gramStart"/>
-      <w:r>
-        <w:rPr>
-          <w:rFonts w:ascii="Times New Roman" w:hAnsi="Times New Roman" w:cs="Times New Roman"/>
-          <w:lang w:val="en-US"/>
-        </w:rPr>
-        <w:t>models</w:t>
-      </w:r>
-      <w:proofErr w:type="gramEnd"/>
-      <w:r>
-        <w:rPr>
-          <w:rFonts w:ascii="Times New Roman" w:hAnsi="Times New Roman" w:cs="Times New Roman"/>
-          <w:lang w:val="en-US"/>
-        </w:rPr>
-        <w:t xml:space="preserve"> relationships between retrieved events,</w:t>
+      <w:r>
+        <w:rPr>
+          <w:rFonts w:ascii="Times New Roman" w:hAnsi="Times New Roman" w:cs="Times New Roman"/>
+          <w:lang w:val="en-US"/>
+        </w:rPr>
+        <w:t>models relationships between retrieved events,</w:t>
       </w:r>
       <w:r>
         <w:rPr>
@@ -6474,21 +6454,12 @@
         </w:rPr>
         <w:t xml:space="preserve"> </w:t>
       </w:r>
-      <w:proofErr w:type="gramStart"/>
-      <w:r>
-        <w:rPr>
-          <w:rFonts w:ascii="Times New Roman" w:hAnsi="Times New Roman" w:cs="Times New Roman"/>
-          <w:lang w:val="en-US"/>
-        </w:rPr>
-        <w:t>The CXR</w:t>
-      </w:r>
-      <w:proofErr w:type="gramEnd"/>
-      <w:r>
-        <w:rPr>
-          <w:rFonts w:ascii="Times New Roman" w:hAnsi="Times New Roman" w:cs="Times New Roman"/>
-          <w:lang w:val="en-US"/>
-        </w:rPr>
-        <w:t xml:space="preserve"> inserts a small but powerful reasoning module between retrieval and attention, ensuring that events first undergo interaction, linking, and relevance scoring before </w:t>
+      <w:r>
+        <w:rPr>
+          <w:rFonts w:ascii="Times New Roman" w:hAnsi="Times New Roman" w:cs="Times New Roman"/>
+          <w:lang w:val="en-US"/>
+        </w:rPr>
+        <w:t xml:space="preserve">The CXR inserts a small but powerful reasoning module between retrieval and attention, ensuring that events first undergo interaction, linking, and relevance scoring before </w:t>
       </w:r>
       <w:r>
         <w:rPr>
@@ -6581,23 +6552,7 @@
           <w:rFonts w:ascii="Times New Roman" w:hAnsi="Times New Roman" w:cs="Times New Roman"/>
           <w:lang w:val="en-US"/>
         </w:rPr>
-        <w:t xml:space="preserve">Mean </w:t>
-      </w:r>
-      <w:proofErr w:type="gramStart"/>
-      <w:r>
-        <w:rPr>
-          <w:rFonts w:ascii="Times New Roman" w:hAnsi="Times New Roman" w:cs="Times New Roman"/>
-          <w:lang w:val="en-US"/>
-        </w:rPr>
-        <w:t>pooling</w:t>
-      </w:r>
-      <w:proofErr w:type="gramEnd"/>
-      <w:r>
-        <w:rPr>
-          <w:rFonts w:ascii="Times New Roman" w:hAnsi="Times New Roman" w:cs="Times New Roman"/>
-          <w:lang w:val="en-US"/>
-        </w:rPr>
-        <w:t xml:space="preserve"> of token embeddings</w:t>
+        <w:t>Mean pooling of token embeddings</w:t>
       </w:r>
     </w:p>
     <w:p>
@@ -7113,21 +7068,12 @@
         </w:rPr>
         <w:t xml:space="preserve">Even after identifying relationships among events, CXR must determine which of them </w:t>
       </w:r>
-      <w:proofErr w:type="gramStart"/>
-      <w:r>
-        <w:rPr>
-          <w:rFonts w:ascii="Times New Roman" w:hAnsi="Times New Roman" w:cs="Times New Roman"/>
-          <w:lang w:val="en-US"/>
-        </w:rPr>
-        <w:t>help</w:t>
-      </w:r>
-      <w:proofErr w:type="gramEnd"/>
-      <w:r>
-        <w:rPr>
-          <w:rFonts w:ascii="Times New Roman" w:hAnsi="Times New Roman" w:cs="Times New Roman"/>
-          <w:lang w:val="en-US"/>
-        </w:rPr>
-        <w:t xml:space="preserve"> answer the current question or continue</w:t>
+      <w:r>
+        <w:rPr>
+          <w:rFonts w:ascii="Times New Roman" w:hAnsi="Times New Roman" w:cs="Times New Roman"/>
+          <w:lang w:val="en-US"/>
+        </w:rPr>
+        <w:t>help answer the current question or continue</w:t>
       </w:r>
       <w:r>
         <w:rPr>
@@ -7362,21 +7308,12 @@
           <w:lang w:val="en-US"/>
         </w:rPr>
       </w:pPr>
-      <w:proofErr w:type="gramStart"/>
-      <w:r>
-        <w:rPr>
-          <w:rFonts w:ascii="Times New Roman" w:hAnsi="Times New Roman" w:cs="Times New Roman"/>
-          <w:lang w:val="en-US"/>
-        </w:rPr>
-        <w:t>The CXR</w:t>
-      </w:r>
-      <w:proofErr w:type="gramEnd"/>
-      <w:r>
-        <w:rPr>
-          <w:rFonts w:ascii="Times New Roman" w:hAnsi="Times New Roman" w:cs="Times New Roman"/>
-          <w:lang w:val="en-US"/>
-        </w:rPr>
-        <w:t xml:space="preserve"> addresses EM-LLM’s </w:t>
+      <w:r>
+        <w:rPr>
+          <w:rFonts w:ascii="Times New Roman" w:hAnsi="Times New Roman" w:cs="Times New Roman"/>
+          <w:lang w:val="en-US"/>
+        </w:rPr>
+        <w:t xml:space="preserve">The CXR addresses EM-LLM’s </w:t>
       </w:r>
       <w:r>
         <w:rPr>
@@ -7732,7 +7669,6 @@
         <w:t xml:space="preserve"> </w:t>
       </w:r>
       <w:proofErr w:type="spellStart"/>
-      <w:proofErr w:type="gramStart"/>
       <w:r>
         <w:rPr>
           <w:rFonts w:ascii="Times New Roman" w:hAnsi="Times New Roman" w:cs="Times New Roman"/>
@@ -7741,7 +7677,6 @@
         <w:t>nn.MultiheadAttention</w:t>
       </w:r>
       <w:proofErr w:type="spellEnd"/>
-      <w:proofErr w:type="gramEnd"/>
     </w:p>
     <w:p>
       <w:pPr>
@@ -8974,23 +8909,7 @@
               <w:rFonts w:ascii="Times New Roman" w:eastAsia="Times New Roman" w:hAnsi="Times New Roman" w:cs="Times New Roman"/>
               <w:color w:val="000000"/>
             </w:rPr>
-            <w:t xml:space="preserve">, “Do Long-Range Language Models Actually Use Long-Range </w:t>
-          </w:r>
-          <w:proofErr w:type="gramStart"/>
-          <w:r>
-            <w:rPr>
-              <w:rFonts w:ascii="Times New Roman" w:eastAsia="Times New Roman" w:hAnsi="Times New Roman" w:cs="Times New Roman"/>
-              <w:color w:val="000000"/>
-            </w:rPr>
-            <w:t>Context?,</w:t>
-          </w:r>
-          <w:proofErr w:type="gramEnd"/>
-          <w:r>
-            <w:rPr>
-              <w:rFonts w:ascii="Times New Roman" w:eastAsia="Times New Roman" w:hAnsi="Times New Roman" w:cs="Times New Roman"/>
-              <w:color w:val="000000"/>
-            </w:rPr>
-            <w:t>” Sep. 2021, [Online]. Available: http://arxiv.org/abs/2109.09115</w:t>
+            <w:t>, “Do Long-Range Language Models Actually Use Long-Range Context?,” Sep. 2021, [Online]. Available: http://arxiv.org/abs/2109.09115</w:t>
           </w:r>
         </w:p>
         <w:p>
@@ -15137,6 +15056,7 @@
   </w:compat>
   <w:rsids>
     <w:rsidRoot w:val="00DD318F"/>
+    <w:rsid w:val="0064606E"/>
     <w:rsid w:val="00B824C7"/>
     <w:rsid w:val="00DD318F"/>
   </w:rsids>
@@ -16235,16 +16155,9 @@
 <file path=customXml/itemProps3.xml><?xml version="1.0" encoding="utf-8"?>
 <ds:datastoreItem xmlns:ds="http://schemas.openxmlformats.org/officeDocument/2006/customXml" ds:itemID="{81337625-10CF-47F1-B329-BC33CAE860EB}">
   <ds:schemaRefs>
+    <ds:schemaRef ds:uri="http://schemas.microsoft.com/office/2006/metadata/properties"/>
+    <ds:schemaRef ds:uri="http://schemas.microsoft.com/office/infopath/2007/PartnerControls"/>
     <ds:schemaRef ds:uri="978c12c1-a4b5-48eb-9710-7e2c09831ca5"/>
-    <ds:schemaRef ds:uri="http://schemas.microsoft.com/office/2006/metadata/properties"/>
-    <ds:schemaRef ds:uri="b22e3cf5-698d-4e0f-9034-25b9c770b27b"/>
-    <ds:schemaRef ds:uri="http://purl.org/dc/elements/1.1/"/>
-    <ds:schemaRef ds:uri="http://purl.org/dc/terms/"/>
-    <ds:schemaRef ds:uri="http://schemas.microsoft.com/office/2006/documentManagement/types"/>
-    <ds:schemaRef ds:uri="http://schemas.microsoft.com/office/infopath/2007/PartnerControls"/>
-    <ds:schemaRef ds:uri="http://schemas.openxmlformats.org/package/2006/metadata/core-properties"/>
-    <ds:schemaRef ds:uri="http://www.w3.org/XML/1998/namespace"/>
-    <ds:schemaRef ds:uri="http://purl.org/dc/dcmitype/"/>
   </ds:schemaRefs>
 </ds:datastoreItem>
 </file>

</xml_diff>

<commit_message>
Working on final documentation
</commit_message>
<xml_diff>
--- a/Documentation/Requirement_Analysis.docx
+++ b/Documentation/Requirement_Analysis.docx
@@ -519,147 +519,7 @@
           <w:rFonts w:ascii="Times New Roman" w:hAnsi="Times New Roman" w:cs="Times New Roman"/>
           <w:lang w:val="en-US"/>
         </w:rPr>
-        <w:t>Summarizing Long Documents</w:t>
-      </w:r>
-      <w:r>
-        <w:rPr>
-          <w:rFonts w:ascii="Times New Roman" w:hAnsi="Times New Roman" w:cs="Times New Roman"/>
-          <w:lang w:val="en-US"/>
-        </w:rPr>
-        <w:t xml:space="preserve">: </w:t>
-      </w:r>
-      <w:r>
-        <w:rPr>
-          <w:rFonts w:ascii="Times New Roman" w:hAnsi="Times New Roman" w:cs="Times New Roman"/>
-          <w:lang w:val="en-US"/>
-        </w:rPr>
-        <w:t>Details from the beginning fade out.</w:t>
-      </w:r>
-      <w:r>
-        <w:rPr>
-          <w:rFonts w:ascii="Times New Roman" w:hAnsi="Times New Roman" w:cs="Times New Roman"/>
-          <w:lang w:val="en-US"/>
-        </w:rPr>
-        <w:t xml:space="preserve"> </w:t>
-      </w:r>
-      <w:r>
-        <w:rPr>
-          <w:rFonts w:ascii="Times New Roman" w:hAnsi="Times New Roman" w:cs="Times New Roman"/>
-          <w:lang w:val="en-US"/>
-        </w:rPr>
-        <w:t xml:space="preserve">When an LLM is asked to summarize a long article, report, or book chapter, </w:t>
-      </w:r>
-      <w:r>
-        <w:rPr>
-          <w:rFonts w:ascii="Times New Roman" w:hAnsi="Times New Roman" w:cs="Times New Roman"/>
-          <w:lang w:val="en-US"/>
-        </w:rPr>
-        <w:t>it tends to give disproportionate weight</w:t>
-      </w:r>
-      <w:r>
-        <w:rPr>
-          <w:rFonts w:ascii="Times New Roman" w:hAnsi="Times New Roman" w:cs="Times New Roman"/>
-          <w:lang w:val="en-US"/>
-        </w:rPr>
-        <w:t xml:space="preserve"> to the most recent sections. Information appearing early in the document becomes nearly invisible to the model due to attention decay. This leads to several problems</w:t>
-      </w:r>
-      <w:r>
-        <w:rPr>
-          <w:rFonts w:ascii="Times New Roman" w:hAnsi="Times New Roman" w:cs="Times New Roman"/>
-          <w:lang w:val="en-US"/>
-        </w:rPr>
-        <w:t xml:space="preserve">. </w:t>
-      </w:r>
-      <w:r>
-        <w:rPr>
-          <w:rFonts w:ascii="Times New Roman" w:hAnsi="Times New Roman" w:cs="Times New Roman"/>
-          <w:lang w:val="en-US"/>
-        </w:rPr>
-        <w:t xml:space="preserve">Key facts introduced </w:t>
-      </w:r>
-      <w:r>
-        <w:rPr>
-          <w:rFonts w:ascii="Times New Roman" w:hAnsi="Times New Roman" w:cs="Times New Roman"/>
-          <w:lang w:val="en-US"/>
-        </w:rPr>
-        <w:t>earlier</w:t>
-      </w:r>
-      <w:r>
-        <w:rPr>
-          <w:rFonts w:ascii="Times New Roman" w:hAnsi="Times New Roman" w:cs="Times New Roman"/>
-          <w:lang w:val="en-US"/>
-        </w:rPr>
-        <w:t xml:space="preserve"> are omitted from the summary.</w:t>
-      </w:r>
-      <w:r>
-        <w:rPr>
-          <w:rFonts w:ascii="Times New Roman" w:hAnsi="Times New Roman" w:cs="Times New Roman"/>
-          <w:lang w:val="en-US"/>
-        </w:rPr>
-        <w:t xml:space="preserve"> </w:t>
-      </w:r>
-      <w:r>
-        <w:rPr>
-          <w:rFonts w:ascii="Times New Roman" w:hAnsi="Times New Roman" w:cs="Times New Roman"/>
-          <w:lang w:val="en-US"/>
-        </w:rPr>
-        <w:t xml:space="preserve">The model often repeats themes from the last few paragraphs because they dominate the </w:t>
-      </w:r>
-      <w:r>
-        <w:rPr>
-          <w:rFonts w:ascii="Times New Roman" w:hAnsi="Times New Roman" w:cs="Times New Roman"/>
-          <w:lang w:val="en-US"/>
-        </w:rPr>
-        <w:t>distribution of attention</w:t>
-      </w:r>
-      <w:r>
-        <w:rPr>
-          <w:rFonts w:ascii="Times New Roman" w:hAnsi="Times New Roman" w:cs="Times New Roman"/>
-          <w:lang w:val="en-US"/>
-        </w:rPr>
-        <w:t>.</w:t>
-      </w:r>
-      <w:r>
-        <w:rPr>
-          <w:rFonts w:ascii="Times New Roman" w:hAnsi="Times New Roman" w:cs="Times New Roman"/>
-          <w:lang w:val="en-US"/>
-        </w:rPr>
-        <w:t xml:space="preserve"> </w:t>
-      </w:r>
-      <w:r>
-        <w:rPr>
-          <w:rFonts w:ascii="Times New Roman" w:hAnsi="Times New Roman" w:cs="Times New Roman"/>
-          <w:lang w:val="en-US"/>
-        </w:rPr>
-        <w:t>Connections between distant sections</w:t>
-      </w:r>
-      <w:r>
-        <w:rPr>
-          <w:rFonts w:ascii="Times New Roman" w:hAnsi="Times New Roman" w:cs="Times New Roman"/>
-          <w:lang w:val="en-US"/>
-        </w:rPr>
-        <w:t xml:space="preserve">, such as the introduction and conclusion of a research paper, </w:t>
-      </w:r>
-      <w:r>
-        <w:rPr>
-          <w:rFonts w:ascii="Times New Roman" w:hAnsi="Times New Roman" w:cs="Times New Roman"/>
-          <w:lang w:val="en-US"/>
-        </w:rPr>
-        <w:t>are usually not captured, causing summaries to lose global coherence.</w:t>
-      </w:r>
-      <w:r>
-        <w:rPr>
-          <w:rFonts w:ascii="Times New Roman" w:hAnsi="Times New Roman" w:cs="Times New Roman"/>
-          <w:lang w:val="en-US"/>
-        </w:rPr>
-        <w:t xml:space="preserve"> </w:t>
-      </w:r>
-      <w:r>
-        <w:rPr>
-          <w:rFonts w:ascii="Times New Roman" w:hAnsi="Times New Roman" w:cs="Times New Roman"/>
-          <w:lang w:val="en-US"/>
-        </w:rPr>
-        <w:t>In practice, this means the model does not understand the document</w:t>
+        <w:t>Summarizing Long Documents: Details from the beginning fade out. When an LLM is asked to summarize a long article, report, or book chapter, it tends to give disproportionate weight to the most recent sections. Information appearing early in the document becomes nearly invisible to the model due to attention decay. This leads to several problems. Key facts introduced earlier are omitted from the summary. The model often repeats themes from the last few paragraphs because they dominate the distribution of attention. Connections between distant sections, such as the introduction and conclusion of a research paper, are usually not captured, causing summaries to lose global coherence. In practice, this means the model does not understand the document</w:t>
       </w:r>
       <w:r>
         <w:rPr>
@@ -673,21 +533,7 @@
           <w:rFonts w:ascii="Times New Roman" w:hAnsi="Times New Roman" w:cs="Times New Roman"/>
           <w:lang w:val="en-US"/>
         </w:rPr>
-        <w:t xml:space="preserve"> focuses on the final chunk it processed. This is fundamentally different from </w:t>
-      </w:r>
-      <w:r>
-        <w:rPr>
-          <w:rFonts w:ascii="Times New Roman" w:hAnsi="Times New Roman" w:cs="Times New Roman"/>
-          <w:lang w:val="en-US"/>
-        </w:rPr>
-        <w:t xml:space="preserve">how humans remember texts, who often recall the beginning and end </w:t>
-      </w:r>
-      <w:r>
-        <w:rPr>
-          <w:rFonts w:ascii="Times New Roman" w:hAnsi="Times New Roman" w:cs="Times New Roman"/>
-          <w:lang w:val="en-US"/>
-        </w:rPr>
-        <w:t>more clearly.</w:t>
+        <w:t xml:space="preserve"> focuses on the final chunk it processed. This is fundamentally different from how humans remember texts, who often recall the beginning and end more clearly.</w:t>
       </w:r>
       <w:sdt>
         <w:sdtPr>
@@ -1899,6 +1745,7 @@
       <w:r>
         <w:rPr>
           <w:rFonts w:ascii="Times New Roman" w:hAnsi="Times New Roman" w:cs="Times New Roman"/>
+          <w:noProof/>
           <w:lang w:val="en-US"/>
         </w:rPr>
         <w:drawing>
@@ -3410,7 +3257,7 @@
         </w:rPr>
         <w:lastRenderedPageBreak/>
         <w:drawing>
-          <wp:inline distT="0" distB="0" distL="0" distR="0" wp14:anchorId="0FD768ED" wp14:editId="575B1C4C">
+          <wp:inline distT="0" distB="0" distL="0" distR="0" wp14:anchorId="0FD768ED" wp14:editId="275A83EF">
             <wp:extent cx="1379785" cy="6908800"/>
             <wp:effectExtent l="19050" t="19050" r="11430" b="25400"/>
             <wp:docPr id="549185832" name="Picture 1" descr="A close-up of a diagram&#10;&#10;AI-generated content may be incorrect."/>
@@ -3617,6 +3464,7 @@
       <w:r>
         <w:rPr>
           <w:rFonts w:ascii="Times New Roman" w:hAnsi="Times New Roman" w:cs="Times New Roman"/>
+          <w:noProof/>
           <w:lang w:val="en-US"/>
         </w:rPr>
         <w:drawing>
@@ -4009,12 +3857,21 @@
         </w:rPr>
         <w:t xml:space="preserve">: </w:t>
       </w:r>
-      <w:r>
-        <w:rPr>
-          <w:rFonts w:ascii="Times New Roman" w:hAnsi="Times New Roman" w:cs="Times New Roman"/>
-          <w:lang w:val="en-US"/>
-        </w:rPr>
-        <w:t xml:space="preserve">Measures </w:t>
+      <w:proofErr w:type="gramStart"/>
+      <w:r>
+        <w:rPr>
+          <w:rFonts w:ascii="Times New Roman" w:hAnsi="Times New Roman" w:cs="Times New Roman"/>
+          <w:lang w:val="en-US"/>
+        </w:rPr>
+        <w:t>Measures</w:t>
+      </w:r>
+      <w:proofErr w:type="gramEnd"/>
+      <w:r>
+        <w:rPr>
+          <w:rFonts w:ascii="Times New Roman" w:hAnsi="Times New Roman" w:cs="Times New Roman"/>
+          <w:lang w:val="en-US"/>
+        </w:rPr>
+        <w:t xml:space="preserve"> </w:t>
       </w:r>
       <w:r>
         <w:rPr>
@@ -5815,12 +5672,21 @@
         </w:rPr>
         <w:t xml:space="preserve"> </w:t>
       </w:r>
-      <w:r>
-        <w:rPr>
-          <w:rFonts w:ascii="Times New Roman" w:hAnsi="Times New Roman" w:cs="Times New Roman"/>
-          <w:lang w:val="en-US"/>
-        </w:rPr>
-        <w:t>models relationships between retrieved events,</w:t>
+      <w:proofErr w:type="gramStart"/>
+      <w:r>
+        <w:rPr>
+          <w:rFonts w:ascii="Times New Roman" w:hAnsi="Times New Roman" w:cs="Times New Roman"/>
+          <w:lang w:val="en-US"/>
+        </w:rPr>
+        <w:t>models</w:t>
+      </w:r>
+      <w:proofErr w:type="gramEnd"/>
+      <w:r>
+        <w:rPr>
+          <w:rFonts w:ascii="Times New Roman" w:hAnsi="Times New Roman" w:cs="Times New Roman"/>
+          <w:lang w:val="en-US"/>
+        </w:rPr>
+        <w:t xml:space="preserve"> relationships between retrieved events,</w:t>
       </w:r>
       <w:r>
         <w:rPr>
@@ -5843,12 +5709,21 @@
         </w:rPr>
         <w:t xml:space="preserve"> </w:t>
       </w:r>
-      <w:r>
-        <w:rPr>
-          <w:rFonts w:ascii="Times New Roman" w:hAnsi="Times New Roman" w:cs="Times New Roman"/>
-          <w:lang w:val="en-US"/>
-        </w:rPr>
-        <w:t>fuses related events,</w:t>
+      <w:proofErr w:type="gramStart"/>
+      <w:r>
+        <w:rPr>
+          <w:rFonts w:ascii="Times New Roman" w:hAnsi="Times New Roman" w:cs="Times New Roman"/>
+          <w:lang w:val="en-US"/>
+        </w:rPr>
+        <w:t>fuses</w:t>
+      </w:r>
+      <w:proofErr w:type="gramEnd"/>
+      <w:r>
+        <w:rPr>
+          <w:rFonts w:ascii="Times New Roman" w:hAnsi="Times New Roman" w:cs="Times New Roman"/>
+          <w:lang w:val="en-US"/>
+        </w:rPr>
+        <w:t xml:space="preserve"> related events,</w:t>
       </w:r>
       <w:r>
         <w:rPr>
@@ -6454,12 +6329,21 @@
         </w:rPr>
         <w:t xml:space="preserve"> </w:t>
       </w:r>
-      <w:r>
-        <w:rPr>
-          <w:rFonts w:ascii="Times New Roman" w:hAnsi="Times New Roman" w:cs="Times New Roman"/>
-          <w:lang w:val="en-US"/>
-        </w:rPr>
-        <w:t xml:space="preserve">The CXR inserts a small but powerful reasoning module between retrieval and attention, ensuring that events first undergo interaction, linking, and relevance scoring before </w:t>
+      <w:proofErr w:type="gramStart"/>
+      <w:r>
+        <w:rPr>
+          <w:rFonts w:ascii="Times New Roman" w:hAnsi="Times New Roman" w:cs="Times New Roman"/>
+          <w:lang w:val="en-US"/>
+        </w:rPr>
+        <w:t>The CXR</w:t>
+      </w:r>
+      <w:proofErr w:type="gramEnd"/>
+      <w:r>
+        <w:rPr>
+          <w:rFonts w:ascii="Times New Roman" w:hAnsi="Times New Roman" w:cs="Times New Roman"/>
+          <w:lang w:val="en-US"/>
+        </w:rPr>
+        <w:t xml:space="preserve"> inserts a small but powerful reasoning module between retrieval and attention, ensuring that events first undergo interaction, linking, and relevance scoring before </w:t>
       </w:r>
       <w:r>
         <w:rPr>
@@ -6552,7 +6436,23 @@
           <w:rFonts w:ascii="Times New Roman" w:hAnsi="Times New Roman" w:cs="Times New Roman"/>
           <w:lang w:val="en-US"/>
         </w:rPr>
-        <w:t>Mean pooling of token embeddings</w:t>
+        <w:t xml:space="preserve">Mean </w:t>
+      </w:r>
+      <w:proofErr w:type="gramStart"/>
+      <w:r>
+        <w:rPr>
+          <w:rFonts w:ascii="Times New Roman" w:hAnsi="Times New Roman" w:cs="Times New Roman"/>
+          <w:lang w:val="en-US"/>
+        </w:rPr>
+        <w:t>pooling</w:t>
+      </w:r>
+      <w:proofErr w:type="gramEnd"/>
+      <w:r>
+        <w:rPr>
+          <w:rFonts w:ascii="Times New Roman" w:hAnsi="Times New Roman" w:cs="Times New Roman"/>
+          <w:lang w:val="en-US"/>
+        </w:rPr>
+        <w:t xml:space="preserve"> of token embeddings</w:t>
       </w:r>
     </w:p>
     <w:p>
@@ -6946,21 +6846,12 @@
           <w:lang w:val="en-US"/>
         </w:rPr>
       </w:pPr>
-      <w:proofErr w:type="spellStart"/>
-      <w:r>
-        <w:rPr>
-          <w:rFonts w:ascii="Times New Roman" w:hAnsi="Times New Roman" w:cs="Times New Roman"/>
-          <w:lang w:val="en-US"/>
-        </w:rPr>
-        <w:t>In</w:t>
-      </w:r>
-      <w:proofErr w:type="spellEnd"/>
-      <w:r>
-        <w:rPr>
-          <w:rFonts w:ascii="Times New Roman" w:hAnsi="Times New Roman" w:cs="Times New Roman"/>
-          <w:lang w:val="en-US"/>
-        </w:rPr>
-        <w:t xml:space="preserve"> many cases, two or more events may describe complementary aspects of the same situation. For instance, a biography may introduce a character in one paragraph and </w:t>
+      <w:r>
+        <w:rPr>
+          <w:rFonts w:ascii="Times New Roman" w:hAnsi="Times New Roman" w:cs="Times New Roman"/>
+          <w:lang w:val="en-US"/>
+        </w:rPr>
+        <w:t xml:space="preserve">In many cases, two or more events may describe complementary aspects of the same situation. For instance, a biography may introduce a character in one paragraph and </w:t>
       </w:r>
       <w:r>
         <w:rPr>
@@ -7068,12 +6959,21 @@
         </w:rPr>
         <w:t xml:space="preserve">Even after identifying relationships among events, CXR must determine which of them </w:t>
       </w:r>
-      <w:r>
-        <w:rPr>
-          <w:rFonts w:ascii="Times New Roman" w:hAnsi="Times New Roman" w:cs="Times New Roman"/>
-          <w:lang w:val="en-US"/>
-        </w:rPr>
-        <w:t>help answer the current question or continue</w:t>
+      <w:proofErr w:type="gramStart"/>
+      <w:r>
+        <w:rPr>
+          <w:rFonts w:ascii="Times New Roman" w:hAnsi="Times New Roman" w:cs="Times New Roman"/>
+          <w:lang w:val="en-US"/>
+        </w:rPr>
+        <w:t>help</w:t>
+      </w:r>
+      <w:proofErr w:type="gramEnd"/>
+      <w:r>
+        <w:rPr>
+          <w:rFonts w:ascii="Times New Roman" w:hAnsi="Times New Roman" w:cs="Times New Roman"/>
+          <w:lang w:val="en-US"/>
+        </w:rPr>
+        <w:t xml:space="preserve"> answer the current question or continue</w:t>
       </w:r>
       <w:r>
         <w:rPr>
@@ -7308,12 +7208,21 @@
           <w:lang w:val="en-US"/>
         </w:rPr>
       </w:pPr>
-      <w:r>
-        <w:rPr>
-          <w:rFonts w:ascii="Times New Roman" w:hAnsi="Times New Roman" w:cs="Times New Roman"/>
-          <w:lang w:val="en-US"/>
-        </w:rPr>
-        <w:t xml:space="preserve">The CXR addresses EM-LLM’s </w:t>
+      <w:proofErr w:type="gramStart"/>
+      <w:r>
+        <w:rPr>
+          <w:rFonts w:ascii="Times New Roman" w:hAnsi="Times New Roman" w:cs="Times New Roman"/>
+          <w:lang w:val="en-US"/>
+        </w:rPr>
+        <w:t>The CXR</w:t>
+      </w:r>
+      <w:proofErr w:type="gramEnd"/>
+      <w:r>
+        <w:rPr>
+          <w:rFonts w:ascii="Times New Roman" w:hAnsi="Times New Roman" w:cs="Times New Roman"/>
+          <w:lang w:val="en-US"/>
+        </w:rPr>
+        <w:t xml:space="preserve"> addresses EM-LLM’s </w:t>
       </w:r>
       <w:r>
         <w:rPr>
@@ -7386,15 +7295,7 @@
           <w:color w:val="auto"/>
           <w:lang w:val="en-US"/>
         </w:rPr>
-        <w:t>Implementation Plan</w:t>
-      </w:r>
-      <w:r>
-        <w:rPr>
-          <w:rFonts w:ascii="Times New Roman" w:hAnsi="Times New Roman" w:cs="Times New Roman"/>
-          <w:color w:val="auto"/>
-          <w:lang w:val="en-US"/>
-        </w:rPr>
-        <w:t xml:space="preserve">: </w:t>
+        <w:t xml:space="preserve">Implementation Plan: </w:t>
       </w:r>
     </w:p>
     <w:p>
@@ -7669,6 +7570,7 @@
         <w:t xml:space="preserve"> </w:t>
       </w:r>
       <w:proofErr w:type="spellStart"/>
+      <w:proofErr w:type="gramStart"/>
       <w:r>
         <w:rPr>
           <w:rFonts w:ascii="Times New Roman" w:hAnsi="Times New Roman" w:cs="Times New Roman"/>
@@ -7677,6 +7579,7 @@
         <w:t>nn.MultiheadAttention</w:t>
       </w:r>
       <w:proofErr w:type="spellEnd"/>
+      <w:proofErr w:type="gramEnd"/>
     </w:p>
     <w:p>
       <w:pPr>
@@ -8560,15 +8463,7 @@
           <w:color w:val="auto"/>
           <w:lang w:val="en-US"/>
         </w:rPr>
-        <w:t>References</w:t>
-      </w:r>
-      <w:r>
-        <w:rPr>
-          <w:rFonts w:ascii="Times New Roman" w:hAnsi="Times New Roman" w:cs="Times New Roman"/>
-          <w:color w:val="auto"/>
-          <w:lang w:val="en-US"/>
-        </w:rPr>
-        <w:t>:</w:t>
+        <w:t>References:</w:t>
       </w:r>
     </w:p>
     <w:p>
@@ -8726,7 +8621,23 @@
               <w:rFonts w:ascii="Times New Roman" w:eastAsia="Times New Roman" w:hAnsi="Times New Roman" w:cs="Times New Roman"/>
               <w:color w:val="000000"/>
             </w:rPr>
-            <w:t>, K. Cho, and Y. Bengio, “Neural Machine Translation by Jointly Learning to Align and Translate,” May 2016, [Online]. Available: http://arxiv.org/abs/1409.0473</w:t>
+            <w:t>, K. Cho, and Y. Bengio, “Neural Machine Translation by Jointly Learning to Align and Translate,” May 2016, [</w:t>
+          </w:r>
+          <w:proofErr w:type="gramStart"/>
+          <w:r>
+            <w:rPr>
+              <w:rFonts w:ascii="Times New Roman" w:eastAsia="Times New Roman" w:hAnsi="Times New Roman" w:cs="Times New Roman"/>
+              <w:color w:val="000000"/>
+            </w:rPr>
+            <w:t>Online</w:t>
+          </w:r>
+          <w:proofErr w:type="gramEnd"/>
+          <w:r>
+            <w:rPr>
+              <w:rFonts w:ascii="Times New Roman" w:eastAsia="Times New Roman" w:hAnsi="Times New Roman" w:cs="Times New Roman"/>
+              <w:color w:val="000000"/>
+            </w:rPr>
+            <w:t>]. Available: http://arxiv.org/abs/1409.0473</w:t>
           </w:r>
         </w:p>
         <w:p>
@@ -8909,7 +8820,23 @@
               <w:rFonts w:ascii="Times New Roman" w:eastAsia="Times New Roman" w:hAnsi="Times New Roman" w:cs="Times New Roman"/>
               <w:color w:val="000000"/>
             </w:rPr>
-            <w:t>, “Do Long-Range Language Models Actually Use Long-Range Context?,” Sep. 2021, [Online]. Available: http://arxiv.org/abs/2109.09115</w:t>
+            <w:t xml:space="preserve">, “Do Long-Range Language Models Actually Use Long-Range </w:t>
+          </w:r>
+          <w:proofErr w:type="gramStart"/>
+          <w:r>
+            <w:rPr>
+              <w:rFonts w:ascii="Times New Roman" w:eastAsia="Times New Roman" w:hAnsi="Times New Roman" w:cs="Times New Roman"/>
+              <w:color w:val="000000"/>
+            </w:rPr>
+            <w:t>Context?,</w:t>
+          </w:r>
+          <w:proofErr w:type="gramEnd"/>
+          <w:r>
+            <w:rPr>
+              <w:rFonts w:ascii="Times New Roman" w:eastAsia="Times New Roman" w:hAnsi="Times New Roman" w:cs="Times New Roman"/>
+              <w:color w:val="000000"/>
+            </w:rPr>
+            <w:t>” Sep. 2021, [Online]. Available: http://arxiv.org/abs/2109.09115</w:t>
           </w:r>
         </w:p>
         <w:p>
@@ -14583,6 +14510,7 @@
   <w:style w:type="character" w:default="1" w:styleId="DefaultParagraphFont">
     <w:name w:val="Default Paragraph Font"/>
     <w:uiPriority w:val="1"/>
+    <w:semiHidden/>
     <w:unhideWhenUsed/>
   </w:style>
   <w:style w:type="table" w:default="1" w:styleId="TableNormal">
@@ -15056,6 +14984,9 @@
   </w:compat>
   <w:rsids>
     <w:rsidRoot w:val="00DD318F"/>
+    <w:rsid w:val="001E0F26"/>
+    <w:rsid w:val="00241D47"/>
+    <w:rsid w:val="003509C2"/>
     <w:rsid w:val="0064606E"/>
     <w:rsid w:val="00B824C7"/>
     <w:rsid w:val="00DD318F"/>
@@ -15519,14 +15450,6 @@
       <w:color w:val="666666"/>
     </w:rPr>
   </w:style>
-  <w:style w:type="paragraph" w:customStyle="1" w:styleId="772334E44E914192AAEB73FEE47662EB">
-    <w:name w:val="772334E44E914192AAEB73FEE47662EB"/>
-    <w:rsid w:val="00DD318F"/>
-  </w:style>
-  <w:style w:type="paragraph" w:customStyle="1" w:styleId="B8369A849A764E1D8D34E2B076EDAA6A">
-    <w:name w:val="B8369A849A764E1D8D34E2B076EDAA6A"/>
-    <w:rsid w:val="00DD318F"/>
-  </w:style>
 </w:styles>
 </file>
 
@@ -15878,6 +15801,15 @@
 </file>
 
 <file path=customXml/item1.xml><?xml version="1.0" encoding="utf-8"?>
+<?mso-contentType ?>
+<FormTemplates xmlns="http://schemas.microsoft.com/sharepoint/v3/contenttype/forms">
+  <Display>DocumentLibraryForm</Display>
+  <Edit>DocumentLibraryForm</Edit>
+  <New>DocumentLibraryForm</New>
+</FormTemplates>
+</file>
+
+<file path=customXml/item2.xml><?xml version="1.0" encoding="utf-8"?>
 <ct:contentTypeSchema xmlns:ct="http://schemas.microsoft.com/office/2006/metadata/contentType" xmlns:ma="http://schemas.microsoft.com/office/2006/metadata/properties/metaAttributes" ct:_="" ma:_="" ma:contentTypeName="Document" ma:contentTypeID="0x010100D18C91BC75D30346A7079A9D779989F9" ma:contentTypeVersion="14" ma:contentTypeDescription="Create a new document." ma:contentTypeScope="" ma:versionID="25391c843e8e7d19487955ac55dcc95a">
   <xsd:schema xmlns:xsd="http://www.w3.org/2001/XMLSchema" xmlns:xs="http://www.w3.org/2001/XMLSchema" xmlns:p="http://schemas.microsoft.com/office/2006/metadata/properties" xmlns:ns3="978c12c1-a4b5-48eb-9710-7e2c09831ca5" xmlns:ns4="b22e3cf5-698d-4e0f-9034-25b9c770b27b" targetNamespace="http://schemas.microsoft.com/office/2006/metadata/properties" ma:root="true" ma:fieldsID="2e1048cd2b3b3c7c0a155da384ab52db" ns3:_="" ns4:_="">
     <xsd:import namespace="978c12c1-a4b5-48eb-9710-7e2c09831ca5"/>
@@ -16104,16 +16036,11 @@
 </ct:contentTypeSchema>
 </file>
 
-<file path=customXml/item2.xml><?xml version="1.0" encoding="utf-8"?>
-<?mso-contentType ?>
-<FormTemplates xmlns="http://schemas.microsoft.com/sharepoint/v3/contenttype/forms">
-  <Display>DocumentLibraryForm</Display>
-  <Edit>DocumentLibraryForm</Edit>
-  <New>DocumentLibraryForm</New>
-</FormTemplates>
+<file path=customXml/item3.xml><?xml version="1.0" encoding="utf-8"?>
+<b:Sources xmlns:b="http://schemas.openxmlformats.org/officeDocument/2006/bibliography" xmlns="http://schemas.openxmlformats.org/officeDocument/2006/bibliography" SelectedStyle="\IEEE2006OfficeOnline.xsl" StyleName="IEEE" Version="2006"/>
 </file>
 
-<file path=customXml/item3.xml><?xml version="1.0" encoding="utf-8"?>
+<file path=customXml/item4.xml><?xml version="1.0" encoding="utf-8"?>
 <p:properties xmlns:p="http://schemas.microsoft.com/office/2006/metadata/properties" xmlns:xsi="http://www.w3.org/2001/XMLSchema-instance" xmlns:pc="http://schemas.microsoft.com/office/infopath/2007/PartnerControls">
   <documentManagement>
     <_activity xmlns="978c12c1-a4b5-48eb-9710-7e2c09831ca5" xsi:nil="true"/>
@@ -16121,11 +16048,15 @@
 </p:properties>
 </file>
 
-<file path=customXml/item4.xml><?xml version="1.0" encoding="utf-8"?>
-<b:Sources xmlns:b="http://schemas.openxmlformats.org/officeDocument/2006/bibliography" xmlns="http://schemas.openxmlformats.org/officeDocument/2006/bibliography" SelectedStyle="\IEEE2006OfficeOnline.xsl" StyleName="IEEE" Version="2006"/>
+<file path=customXml/itemProps1.xml><?xml version="1.0" encoding="utf-8"?>
+<ds:datastoreItem xmlns:ds="http://schemas.openxmlformats.org/officeDocument/2006/customXml" ds:itemID="{03FE0D6F-1212-4EBE-935D-3083DC2CE32A}">
+  <ds:schemaRefs>
+    <ds:schemaRef ds:uri="http://schemas.microsoft.com/sharepoint/v3/contenttype/forms"/>
+  </ds:schemaRefs>
+</ds:datastoreItem>
 </file>
 
-<file path=customXml/itemProps1.xml><?xml version="1.0" encoding="utf-8"?>
+<file path=customXml/itemProps2.xml><?xml version="1.0" encoding="utf-8"?>
 <ds:datastoreItem xmlns:ds="http://schemas.openxmlformats.org/officeDocument/2006/customXml" ds:itemID="{6FB611CA-CA4E-4588-A409-854A04E757DE}">
   <ds:schemaRefs>
     <ds:schemaRef ds:uri="http://schemas.microsoft.com/office/2006/metadata/contentType"/>
@@ -16144,15 +16075,15 @@
 </ds:datastoreItem>
 </file>
 
-<file path=customXml/itemProps2.xml><?xml version="1.0" encoding="utf-8"?>
-<ds:datastoreItem xmlns:ds="http://schemas.openxmlformats.org/officeDocument/2006/customXml" ds:itemID="{03FE0D6F-1212-4EBE-935D-3083DC2CE32A}">
+<file path=customXml/itemProps3.xml><?xml version="1.0" encoding="utf-8"?>
+<ds:datastoreItem xmlns:ds="http://schemas.openxmlformats.org/officeDocument/2006/customXml" ds:itemID="{4CBD361B-1B09-4885-B2C4-D3C6DBBBD325}">
   <ds:schemaRefs>
-    <ds:schemaRef ds:uri="http://schemas.microsoft.com/sharepoint/v3/contenttype/forms"/>
+    <ds:schemaRef ds:uri="http://schemas.openxmlformats.org/officeDocument/2006/bibliography"/>
   </ds:schemaRefs>
 </ds:datastoreItem>
 </file>
 
-<file path=customXml/itemProps3.xml><?xml version="1.0" encoding="utf-8"?>
+<file path=customXml/itemProps4.xml><?xml version="1.0" encoding="utf-8"?>
 <ds:datastoreItem xmlns:ds="http://schemas.openxmlformats.org/officeDocument/2006/customXml" ds:itemID="{81337625-10CF-47F1-B329-BC33CAE860EB}">
   <ds:schemaRefs>
     <ds:schemaRef ds:uri="http://schemas.microsoft.com/office/2006/metadata/properties"/>
@@ -16160,12 +16091,4 @@
     <ds:schemaRef ds:uri="978c12c1-a4b5-48eb-9710-7e2c09831ca5"/>
   </ds:schemaRefs>
 </ds:datastoreItem>
-</file>
-
-<file path=customXml/itemProps4.xml><?xml version="1.0" encoding="utf-8"?>
-<ds:datastoreItem xmlns:ds="http://schemas.openxmlformats.org/officeDocument/2006/customXml" ds:itemID="{4CBD361B-1B09-4885-B2C4-D3C6DBBBD325}">
-  <ds:schemaRefs>
-    <ds:schemaRef ds:uri="http://schemas.openxmlformats.org/officeDocument/2006/bibliography"/>
-  </ds:schemaRefs>
-</ds:datastoreItem>
 </file>
</xml_diff>